<commit_message>
Module4 upto Topic10 completed
</commit_message>
<xml_diff>
--- a/Module4 Test driven development and Logging framework/Module 4 Theory.docx
+++ b/Module4 Test driven development and Logging framework/Module 4 Theory.docx
@@ -1106,21 +1106,12 @@
         </w:rPr>
         <w:t xml:space="preserve"> </w:t>
       </w:r>
-      <w:proofErr w:type="spellStart"/>
-      <w:r>
-        <w:rPr>
-          <w:sz w:val="24"/>
-          <w:szCs w:val="24"/>
-        </w:rPr>
-        <w:t>Mockito</w:t>
-      </w:r>
-      <w:proofErr w:type="spellEnd"/>
-      <w:r>
-        <w:rPr>
-          <w:sz w:val="24"/>
-          <w:szCs w:val="24"/>
-        </w:rPr>
-        <w:t xml:space="preserve"> Basics</w:t>
+      <w:r>
+        <w:rPr>
+          <w:sz w:val="24"/>
+          <w:szCs w:val="24"/>
+        </w:rPr>
+        <w:t>Mockito Basics</w:t>
       </w:r>
       <w:r>
         <w:t xml:space="preserve"> </w:t>
@@ -1176,15 +1167,7 @@
           <w:sz w:val="24"/>
           <w:szCs w:val="24"/>
         </w:rPr>
-        <w:t xml:space="preserve">Introduction to </w:t>
-      </w:r>
-      <w:proofErr w:type="spellStart"/>
-      <w:r>
-        <w:rPr>
-          <w:sz w:val="24"/>
-          <w:szCs w:val="24"/>
-        </w:rPr>
-        <w:t>Mockito</w:t>
+        <w:t>Introduction to Mockito</w:t>
       </w:r>
     </w:p>
     <w:p>
@@ -1201,7 +1184,6 @@
           <w:lang w:val="en-US"/>
         </w:rPr>
       </w:pPr>
-      <w:proofErr w:type="spellEnd"/>
       <w:r>
         <w:rPr>
           <w:sz w:val="24"/>
@@ -1333,17 +1315,8 @@
           <w:sz w:val="24"/>
           <w:szCs w:val="24"/>
         </w:rPr>
-        <w:t xml:space="preserve">Testing Spring Applications with JUnit and </w:t>
-      </w:r>
-      <w:proofErr w:type="spellStart"/>
-      <w:r>
-        <w:rPr>
-          <w:sz w:val="24"/>
-          <w:szCs w:val="24"/>
-        </w:rPr>
-        <w:t>Mockito</w:t>
-      </w:r>
-      <w:proofErr w:type="spellEnd"/>
+        <w:t>Testing Spring Applications with JUnit and Mockito</w:t>
+      </w:r>
       <w:r>
         <w:t xml:space="preserve"> </w:t>
       </w:r>
@@ -1639,23 +1612,7 @@
           <w:sz w:val="24"/>
           <w:szCs w:val="24"/>
         </w:rPr>
-        <w:t xml:space="preserve">Mocking </w:t>
-      </w:r>
-      <w:proofErr w:type="gramStart"/>
-      <w:r>
-        <w:rPr>
-          <w:sz w:val="24"/>
-          <w:szCs w:val="24"/>
-        </w:rPr>
-        <w:t>file</w:t>
-      </w:r>
-      <w:proofErr w:type="gramEnd"/>
-      <w:r>
-        <w:rPr>
-          <w:sz w:val="24"/>
-          <w:szCs w:val="24"/>
-        </w:rPr>
-        <w:t xml:space="preserve"> I/O and net</w:t>
+        <w:t>Mocking file I/O and net</w:t>
       </w:r>
       <w:r>
         <w:rPr>
@@ -1685,6 +1642,173 @@
           <w:szCs w:val="24"/>
         </w:rPr>
         <w:t>Strategies for testing code with external dependencies</w:t>
+      </w:r>
+    </w:p>
+    <w:p>
+      <w:pPr>
+        <w:rPr>
+          <w:b/>
+          <w:sz w:val="24"/>
+          <w:szCs w:val="24"/>
+          <w:lang w:val="en-US"/>
+        </w:rPr>
+      </w:pPr>
+      <w:r>
+        <w:rPr>
+          <w:b/>
+          <w:sz w:val="24"/>
+          <w:szCs w:val="24"/>
+          <w:lang w:val="en-US"/>
+        </w:rPr>
+        <w:t>Topic 9 completed</w:t>
+      </w:r>
+    </w:p>
+    <w:p>
+      <w:pPr>
+        <w:rPr>
+          <w:b/>
+          <w:sz w:val="24"/>
+          <w:szCs w:val="24"/>
+          <w:lang w:val="en-US"/>
+        </w:rPr>
+      </w:pPr>
+    </w:p>
+    <w:p>
+      <w:pPr>
+        <w:pStyle w:val="ListParagraph"/>
+        <w:numPr>
+          <w:ilvl w:val="0"/>
+          <w:numId w:val="1"/>
+        </w:numPr>
+        <w:ind w:left="567"/>
+        <w:rPr>
+          <w:b/>
+          <w:sz w:val="24"/>
+          <w:szCs w:val="24"/>
+          <w:lang w:val="en-US"/>
+        </w:rPr>
+      </w:pPr>
+      <w:r>
+        <w:rPr>
+          <w:b/>
+          <w:sz w:val="28"/>
+          <w:szCs w:val="28"/>
+          <w:lang w:val="en-US"/>
+        </w:rPr>
+        <w:t>Concept:</w:t>
+      </w:r>
+      <w:r>
+        <w:rPr>
+          <w:b/>
+          <w:sz w:val="24"/>
+          <w:szCs w:val="24"/>
+          <w:lang w:val="en-US"/>
+        </w:rPr>
+        <w:t xml:space="preserve"> </w:t>
+      </w:r>
+      <w:r>
+        <w:rPr>
+          <w:sz w:val="24"/>
+          <w:szCs w:val="24"/>
+        </w:rPr>
+        <w:t>Introduction to Automation Testing</w:t>
+      </w:r>
+      <w:r>
+        <w:t xml:space="preserve"> </w:t>
+      </w:r>
+    </w:p>
+    <w:p>
+      <w:pPr>
+        <w:pStyle w:val="ListParagraph"/>
+        <w:ind w:left="567"/>
+        <w:rPr>
+          <w:b/>
+          <w:sz w:val="28"/>
+          <w:szCs w:val="28"/>
+          <w:lang w:val="en-US"/>
+        </w:rPr>
+      </w:pPr>
+    </w:p>
+    <w:p>
+      <w:pPr>
+        <w:pStyle w:val="ListParagraph"/>
+        <w:ind w:left="567"/>
+        <w:rPr>
+          <w:b/>
+          <w:sz w:val="28"/>
+          <w:szCs w:val="28"/>
+          <w:lang w:val="en-US"/>
+        </w:rPr>
+      </w:pPr>
+      <w:r>
+        <w:rPr>
+          <w:b/>
+          <w:sz w:val="28"/>
+          <w:szCs w:val="28"/>
+          <w:lang w:val="en-US"/>
+        </w:rPr>
+        <w:t>Topics:</w:t>
+      </w:r>
+    </w:p>
+    <w:p>
+      <w:pPr>
+        <w:pStyle w:val="ListParagraph"/>
+        <w:numPr>
+          <w:ilvl w:val="0"/>
+          <w:numId w:val="16"/>
+        </w:numPr>
+      </w:pPr>
+      <w:r>
+        <w:t>What is Automation Testing</w:t>
+      </w:r>
+    </w:p>
+    <w:p>
+      <w:pPr>
+        <w:pStyle w:val="ListParagraph"/>
+        <w:numPr>
+          <w:ilvl w:val="0"/>
+          <w:numId w:val="16"/>
+        </w:numPr>
+      </w:pPr>
+      <w:r>
+        <w:t>Benefits of Automation Testing</w:t>
+      </w:r>
+    </w:p>
+    <w:p>
+      <w:pPr>
+        <w:pStyle w:val="ListParagraph"/>
+        <w:numPr>
+          <w:ilvl w:val="0"/>
+          <w:numId w:val="16"/>
+        </w:numPr>
+        <w:rPr>
+          <w:b/>
+          <w:sz w:val="24"/>
+          <w:szCs w:val="24"/>
+          <w:lang w:val="en-US"/>
+        </w:rPr>
+      </w:pPr>
+      <w:r>
+        <w:t>Manual Testing vs. Automation Testing</w:t>
+      </w:r>
+    </w:p>
+    <w:p>
+      <w:pPr>
+        <w:rPr>
+          <w:b/>
+          <w:sz w:val="24"/>
+          <w:szCs w:val="24"/>
+          <w:lang w:val="en-US"/>
+        </w:rPr>
+      </w:pPr>
+      <w:r>
+        <w:rPr>
+          <w:b/>
+          <w:sz w:val="24"/>
+          <w:szCs w:val="24"/>
+          <w:lang w:val="en-US"/>
+        </w:rPr>
+        <w:t>Topic 10 completed</w:t>
       </w:r>
       <w:bookmarkStart w:id="0" w:name="_GoBack"/>
       <w:bookmarkEnd w:id="0"/>
@@ -2088,6 +2212,119 @@
     </w:lvl>
   </w:abstractNum>
   <w:abstractNum w:abstractNumId="4" w15:restartNumberingAfterBreak="0">
+    <w:nsid w:val="1D352C61"/>
+    <w:multiLevelType w:val="hybridMultilevel"/>
+    <w:tmpl w:val="7BCCD7AE"/>
+    <w:lvl w:ilvl="0" w:tplc="40090001">
+      <w:start w:val="1"/>
+      <w:numFmt w:val="bullet"/>
+      <w:lvlText w:val=""/>
+      <w:lvlJc w:val="left"/>
+      <w:pPr>
+        <w:ind w:left="1287" w:hanging="360"/>
+      </w:pPr>
+      <w:rPr>
+        <w:rFonts w:ascii="Symbol" w:hAnsi="Symbol" w:hint="default"/>
+      </w:rPr>
+    </w:lvl>
+    <w:lvl w:ilvl="1" w:tplc="40090003" w:tentative="1">
+      <w:start w:val="1"/>
+      <w:numFmt w:val="bullet"/>
+      <w:lvlText w:val="o"/>
+      <w:lvlJc w:val="left"/>
+      <w:pPr>
+        <w:ind w:left="2007" w:hanging="360"/>
+      </w:pPr>
+      <w:rPr>
+        <w:rFonts w:ascii="Courier New" w:hAnsi="Courier New" w:cs="Courier New" w:hint="default"/>
+      </w:rPr>
+    </w:lvl>
+    <w:lvl w:ilvl="2" w:tplc="40090005" w:tentative="1">
+      <w:start w:val="1"/>
+      <w:numFmt w:val="bullet"/>
+      <w:lvlText w:val=""/>
+      <w:lvlJc w:val="left"/>
+      <w:pPr>
+        <w:ind w:left="2727" w:hanging="360"/>
+      </w:pPr>
+      <w:rPr>
+        <w:rFonts w:ascii="Wingdings" w:hAnsi="Wingdings" w:hint="default"/>
+      </w:rPr>
+    </w:lvl>
+    <w:lvl w:ilvl="3" w:tplc="40090001" w:tentative="1">
+      <w:start w:val="1"/>
+      <w:numFmt w:val="bullet"/>
+      <w:lvlText w:val=""/>
+      <w:lvlJc w:val="left"/>
+      <w:pPr>
+        <w:ind w:left="3447" w:hanging="360"/>
+      </w:pPr>
+      <w:rPr>
+        <w:rFonts w:ascii="Symbol" w:hAnsi="Symbol" w:hint="default"/>
+      </w:rPr>
+    </w:lvl>
+    <w:lvl w:ilvl="4" w:tplc="40090003" w:tentative="1">
+      <w:start w:val="1"/>
+      <w:numFmt w:val="bullet"/>
+      <w:lvlText w:val="o"/>
+      <w:lvlJc w:val="left"/>
+      <w:pPr>
+        <w:ind w:left="4167" w:hanging="360"/>
+      </w:pPr>
+      <w:rPr>
+        <w:rFonts w:ascii="Courier New" w:hAnsi="Courier New" w:cs="Courier New" w:hint="default"/>
+      </w:rPr>
+    </w:lvl>
+    <w:lvl w:ilvl="5" w:tplc="40090005" w:tentative="1">
+      <w:start w:val="1"/>
+      <w:numFmt w:val="bullet"/>
+      <w:lvlText w:val=""/>
+      <w:lvlJc w:val="left"/>
+      <w:pPr>
+        <w:ind w:left="4887" w:hanging="360"/>
+      </w:pPr>
+      <w:rPr>
+        <w:rFonts w:ascii="Wingdings" w:hAnsi="Wingdings" w:hint="default"/>
+      </w:rPr>
+    </w:lvl>
+    <w:lvl w:ilvl="6" w:tplc="40090001" w:tentative="1">
+      <w:start w:val="1"/>
+      <w:numFmt w:val="bullet"/>
+      <w:lvlText w:val=""/>
+      <w:lvlJc w:val="left"/>
+      <w:pPr>
+        <w:ind w:left="5607" w:hanging="360"/>
+      </w:pPr>
+      <w:rPr>
+        <w:rFonts w:ascii="Symbol" w:hAnsi="Symbol" w:hint="default"/>
+      </w:rPr>
+    </w:lvl>
+    <w:lvl w:ilvl="7" w:tplc="40090003" w:tentative="1">
+      <w:start w:val="1"/>
+      <w:numFmt w:val="bullet"/>
+      <w:lvlText w:val="o"/>
+      <w:lvlJc w:val="left"/>
+      <w:pPr>
+        <w:ind w:left="6327" w:hanging="360"/>
+      </w:pPr>
+      <w:rPr>
+        <w:rFonts w:ascii="Courier New" w:hAnsi="Courier New" w:cs="Courier New" w:hint="default"/>
+      </w:rPr>
+    </w:lvl>
+    <w:lvl w:ilvl="8" w:tplc="40090005" w:tentative="1">
+      <w:start w:val="1"/>
+      <w:numFmt w:val="bullet"/>
+      <w:lvlText w:val=""/>
+      <w:lvlJc w:val="left"/>
+      <w:pPr>
+        <w:ind w:left="7047" w:hanging="360"/>
+      </w:pPr>
+      <w:rPr>
+        <w:rFonts w:ascii="Wingdings" w:hAnsi="Wingdings" w:hint="default"/>
+      </w:rPr>
+    </w:lvl>
+  </w:abstractNum>
+  <w:abstractNum w:abstractNumId="5" w15:restartNumberingAfterBreak="0">
     <w:nsid w:val="252777F5"/>
     <w:multiLevelType w:val="hybridMultilevel"/>
     <w:tmpl w:val="A41423E0"/>
@@ -2200,7 +2437,7 @@
       </w:rPr>
     </w:lvl>
   </w:abstractNum>
-  <w:abstractNum w:abstractNumId="5" w15:restartNumberingAfterBreak="0">
+  <w:abstractNum w:abstractNumId="6" w15:restartNumberingAfterBreak="0">
     <w:nsid w:val="260A79A1"/>
     <w:multiLevelType w:val="hybridMultilevel"/>
     <w:tmpl w:val="C3369AAC"/>
@@ -2313,7 +2550,7 @@
       </w:rPr>
     </w:lvl>
   </w:abstractNum>
-  <w:abstractNum w:abstractNumId="6" w15:restartNumberingAfterBreak="0">
+  <w:abstractNum w:abstractNumId="7" w15:restartNumberingAfterBreak="0">
     <w:nsid w:val="2FB26BBD"/>
     <w:multiLevelType w:val="hybridMultilevel"/>
     <w:tmpl w:val="1C706678"/>
@@ -2426,7 +2663,7 @@
       </w:rPr>
     </w:lvl>
   </w:abstractNum>
-  <w:abstractNum w:abstractNumId="7" w15:restartNumberingAfterBreak="0">
+  <w:abstractNum w:abstractNumId="8" w15:restartNumberingAfterBreak="0">
     <w:nsid w:val="3287148B"/>
     <w:multiLevelType w:val="hybridMultilevel"/>
     <w:tmpl w:val="90441E76"/>
@@ -2539,7 +2776,7 @@
       </w:rPr>
     </w:lvl>
   </w:abstractNum>
-  <w:abstractNum w:abstractNumId="8" w15:restartNumberingAfterBreak="0">
+  <w:abstractNum w:abstractNumId="9" w15:restartNumberingAfterBreak="0">
     <w:nsid w:val="3A6D1EEB"/>
     <w:multiLevelType w:val="hybridMultilevel"/>
     <w:tmpl w:val="A4E43B0A"/>
@@ -2652,7 +2889,98 @@
       </w:rPr>
     </w:lvl>
   </w:abstractNum>
-  <w:abstractNum w:abstractNumId="9" w15:restartNumberingAfterBreak="0">
+  <w:abstractNum w:abstractNumId="10" w15:restartNumberingAfterBreak="0">
+    <w:nsid w:val="4637002E"/>
+    <w:multiLevelType w:val="hybridMultilevel"/>
+    <w:tmpl w:val="DA102FDE"/>
+    <w:lvl w:ilvl="0" w:tplc="B21C7362">
+      <w:start w:val="1"/>
+      <w:numFmt w:val="decimal"/>
+      <w:lvlText w:val="%1)"/>
+      <w:lvlJc w:val="left"/>
+      <w:pPr>
+        <w:ind w:left="720" w:hanging="360"/>
+      </w:pPr>
+      <w:rPr>
+        <w:rFonts w:hint="default"/>
+        <w:sz w:val="28"/>
+        <w:szCs w:val="28"/>
+      </w:rPr>
+    </w:lvl>
+    <w:lvl w:ilvl="1" w:tplc="40090019" w:tentative="1">
+      <w:start w:val="1"/>
+      <w:numFmt w:val="lowerLetter"/>
+      <w:lvlText w:val="%2."/>
+      <w:lvlJc w:val="left"/>
+      <w:pPr>
+        <w:ind w:left="1440" w:hanging="360"/>
+      </w:pPr>
+    </w:lvl>
+    <w:lvl w:ilvl="2" w:tplc="4009001B" w:tentative="1">
+      <w:start w:val="1"/>
+      <w:numFmt w:val="lowerRoman"/>
+      <w:lvlText w:val="%3."/>
+      <w:lvlJc w:val="right"/>
+      <w:pPr>
+        <w:ind w:left="2160" w:hanging="180"/>
+      </w:pPr>
+    </w:lvl>
+    <w:lvl w:ilvl="3" w:tplc="4009000F" w:tentative="1">
+      <w:start w:val="1"/>
+      <w:numFmt w:val="decimal"/>
+      <w:lvlText w:val="%4."/>
+      <w:lvlJc w:val="left"/>
+      <w:pPr>
+        <w:ind w:left="2880" w:hanging="360"/>
+      </w:pPr>
+    </w:lvl>
+    <w:lvl w:ilvl="4" w:tplc="40090019" w:tentative="1">
+      <w:start w:val="1"/>
+      <w:numFmt w:val="lowerLetter"/>
+      <w:lvlText w:val="%5."/>
+      <w:lvlJc w:val="left"/>
+      <w:pPr>
+        <w:ind w:left="3600" w:hanging="360"/>
+      </w:pPr>
+    </w:lvl>
+    <w:lvl w:ilvl="5" w:tplc="4009001B" w:tentative="1">
+      <w:start w:val="1"/>
+      <w:numFmt w:val="lowerRoman"/>
+      <w:lvlText w:val="%6."/>
+      <w:lvlJc w:val="right"/>
+      <w:pPr>
+        <w:ind w:left="4320" w:hanging="180"/>
+      </w:pPr>
+    </w:lvl>
+    <w:lvl w:ilvl="6" w:tplc="4009000F" w:tentative="1">
+      <w:start w:val="1"/>
+      <w:numFmt w:val="decimal"/>
+      <w:lvlText w:val="%7."/>
+      <w:lvlJc w:val="left"/>
+      <w:pPr>
+        <w:ind w:left="5040" w:hanging="360"/>
+      </w:pPr>
+    </w:lvl>
+    <w:lvl w:ilvl="7" w:tplc="40090019" w:tentative="1">
+      <w:start w:val="1"/>
+      <w:numFmt w:val="lowerLetter"/>
+      <w:lvlText w:val="%8."/>
+      <w:lvlJc w:val="left"/>
+      <w:pPr>
+        <w:ind w:left="5760" w:hanging="360"/>
+      </w:pPr>
+    </w:lvl>
+    <w:lvl w:ilvl="8" w:tplc="4009001B" w:tentative="1">
+      <w:start w:val="1"/>
+      <w:numFmt w:val="lowerRoman"/>
+      <w:lvlText w:val="%9."/>
+      <w:lvlJc w:val="right"/>
+      <w:pPr>
+        <w:ind w:left="6480" w:hanging="180"/>
+      </w:pPr>
+    </w:lvl>
+  </w:abstractNum>
+  <w:abstractNum w:abstractNumId="11" w15:restartNumberingAfterBreak="0">
     <w:nsid w:val="4CCF66ED"/>
     <w:multiLevelType w:val="hybridMultilevel"/>
     <w:tmpl w:val="DA102FDE"/>
@@ -2743,7 +3071,7 @@
       </w:pPr>
     </w:lvl>
   </w:abstractNum>
-  <w:abstractNum w:abstractNumId="10" w15:restartNumberingAfterBreak="0">
+  <w:abstractNum w:abstractNumId="12" w15:restartNumberingAfterBreak="0">
     <w:nsid w:val="53146F25"/>
     <w:multiLevelType w:val="hybridMultilevel"/>
     <w:tmpl w:val="72E099B6"/>
@@ -2856,7 +3184,7 @@
       </w:rPr>
     </w:lvl>
   </w:abstractNum>
-  <w:abstractNum w:abstractNumId="11" w15:restartNumberingAfterBreak="0">
+  <w:abstractNum w:abstractNumId="13" w15:restartNumberingAfterBreak="0">
     <w:nsid w:val="649150A6"/>
     <w:multiLevelType w:val="hybridMultilevel"/>
     <w:tmpl w:val="DA102FDE"/>
@@ -2947,7 +3275,7 @@
       </w:pPr>
     </w:lvl>
   </w:abstractNum>
-  <w:abstractNum w:abstractNumId="12" w15:restartNumberingAfterBreak="0">
+  <w:abstractNum w:abstractNumId="14" w15:restartNumberingAfterBreak="0">
     <w:nsid w:val="75EA61F5"/>
     <w:multiLevelType w:val="hybridMultilevel"/>
     <w:tmpl w:val="785A902E"/>
@@ -3060,7 +3388,7 @@
       </w:rPr>
     </w:lvl>
   </w:abstractNum>
-  <w:abstractNum w:abstractNumId="13" w15:restartNumberingAfterBreak="0">
+  <w:abstractNum w:abstractNumId="15" w15:restartNumberingAfterBreak="0">
     <w:nsid w:val="79767E01"/>
     <w:multiLevelType w:val="hybridMultilevel"/>
     <w:tmpl w:val="61CE7252"/>
@@ -3177,43 +3505,49 @@
     <w:abstractNumId w:val="0"/>
   </w:num>
   <w:num w:numId="2">
-    <w:abstractNumId w:val="13"/>
+    <w:abstractNumId w:val="15"/>
   </w:num>
   <w:num w:numId="3">
-    <w:abstractNumId w:val="12"/>
+    <w:abstractNumId w:val="14"/>
   </w:num>
   <w:num w:numId="4">
-    <w:abstractNumId w:val="9"/>
+    <w:abstractNumId w:val="11"/>
   </w:num>
   <w:num w:numId="5">
-    <w:abstractNumId w:val="8"/>
+    <w:abstractNumId w:val="9"/>
   </w:num>
   <w:num w:numId="6">
     <w:abstractNumId w:val="1"/>
   </w:num>
   <w:num w:numId="7">
-    <w:abstractNumId w:val="4"/>
+    <w:abstractNumId w:val="5"/>
   </w:num>
   <w:num w:numId="8">
     <w:abstractNumId w:val="2"/>
   </w:num>
   <w:num w:numId="9">
-    <w:abstractNumId w:val="5"/>
+    <w:abstractNumId w:val="6"/>
   </w:num>
   <w:num w:numId="10">
-    <w:abstractNumId w:val="11"/>
+    <w:abstractNumId w:val="13"/>
   </w:num>
   <w:num w:numId="11">
-    <w:abstractNumId w:val="7"/>
+    <w:abstractNumId w:val="8"/>
   </w:num>
   <w:num w:numId="12">
-    <w:abstractNumId w:val="10"/>
+    <w:abstractNumId w:val="12"/>
   </w:num>
   <w:num w:numId="13">
     <w:abstractNumId w:val="3"/>
   </w:num>
   <w:num w:numId="14">
-    <w:abstractNumId w:val="6"/>
+    <w:abstractNumId w:val="7"/>
+  </w:num>
+  <w:num w:numId="15">
+    <w:abstractNumId w:val="10"/>
+  </w:num>
+  <w:num w:numId="16">
+    <w:abstractNumId w:val="4"/>
   </w:num>
 </w:numbering>
 </file>

</xml_diff>